<commit_message>
Alinha cargos com o LinkedIn no site, nos CVs e no video
Ouse Passar como Software Engineer (tempo integral), Inovatec como Full
Stack Software Engineer; separadores dos CVs PT/EN iguais ao original ES.

Co-Authored-By: Claude Opus 5.5 <noreply@anthropic.com>
</commit_message>
<xml_diff>
--- a/cv/Curriculo_Joao_Pedro_Full_Stack_EN.docx
+++ b/cv/Curriculo_Joao_Pedro_Full_Stack_EN.docx
@@ -102,7 +102,7 @@
         <w:pStyle w:val="Role"/>
       </w:pPr>
       <w:r>
-        <w:t xml:space="preserve">Full Stack Developer – Inovatec-JP</w:t>
+        <w:t xml:space="preserve">Full Stack Software Engineer · Inovatec-JP</w:t>
       </w:r>
       <w:r>
         <w:rPr>
@@ -162,7 +162,7 @@
         <w:pStyle w:val="Role"/>
       </w:pPr>
       <w:r>
-        <w:t xml:space="preserve">Full Stack Developer – Ouse Passar</w:t>
+        <w:t xml:space="preserve">Software Engineer · Ouse Passar</w:t>
       </w:r>
       <w:r>
         <w:rPr>
@@ -225,7 +225,7 @@
         <w:pStyle w:val="Role"/>
       </w:pPr>
       <w:r>
-        <w:t xml:space="preserve">Software Development Intern – Sicredi </w:t>
+        <w:t xml:space="preserve">Software Development Intern · Sicredi </w:t>
       </w:r>
       <w:r>
         <w:t>Evolução</w:t>
@@ -295,7 +295,7 @@
         <w:pStyle w:val="Role"/>
       </w:pPr>
       <w:r>
-        <w:t xml:space="preserve">IT Support Technician – Sicredi Evolução</w:t>
+        <w:t xml:space="preserve">IT Support Technician · Sicredi Evolução</w:t>
       </w:r>
       <w:r>
         <w:rPr>
@@ -325,7 +325,7 @@
         <w:pStyle w:val="Role"/>
       </w:pPr>
       <w:r>
-        <w:t xml:space="preserve">Software Developer – Dev </w:t>
+        <w:t xml:space="preserve">Software Developer · Dev </w:t>
       </w:r>
       <w:r>
         <w:t xml:space="preserve">Dynamos </w:t>
@@ -373,7 +373,7 @@
         <w:pStyle w:val="Role"/>
       </w:pPr>
       <w:r>
-        <w:t xml:space="preserve">Shark Smokehouse – E-commerce + Lounge</w:t>
+        <w:t xml:space="preserve">Shark Smokehouse · E-commerce + Lounge</w:t>
       </w:r>
       <w:r>
         <w:rPr>
@@ -403,7 +403,7 @@
         <w:pStyle w:val="Role"/>
       </w:pPr>
       <w:r>
-        <w:t xml:space="preserve">Código da Vida – iOS / Android / Web App</w:t>
+        <w:t xml:space="preserve">Código da Vida · iOS / Android / Web App</w:t>
       </w:r>
       <w:r>
         <w:rPr>
@@ -433,7 +433,7 @@
         <w:pStyle w:val="Role"/>
       </w:pPr>
       <w:r>
-        <w:t xml:space="preserve">Ouse Passar – Education platform</w:t>
+        <w:t xml:space="preserve">Ouse Passar · Education platform</w:t>
       </w:r>
       <w:r>
         <w:rPr>
@@ -544,7 +544,7 @@
         <w:t xml:space="preserve">Master’s Degree in Business Process Management and Technologies</w:t>
       </w:r>
       <w:r>
-        <w:t xml:space="preserve"> – University of Granada | 2026–2027</w:t>
+        <w:t xml:space="preserve"> — University of Granada | 2026–2027</w:t>
       </w:r>
     </w:p>
     <w:p>
@@ -556,7 +556,7 @@
         <w:t xml:space="preserve">Bachelor’s Degree in Computer Science</w:t>
       </w:r>
       <w:r>
-        <w:t xml:space="preserve"> – Centro Universitário UNIPÊ, Brazil | 2025</w:t>
+        <w:t xml:space="preserve"> — Centro Universitário UNIPÊ, Brazil | 2025</w:t>
       </w:r>
     </w:p>
     <w:p>
@@ -569,7 +569,7 @@
     </w:p>
     <w:p>
       <w:r>
-        <w:t xml:space="preserve">1.Complete Java: Object-Oriented Programming and Projects – Udemy  </w:t>
+        <w:t xml:space="preserve">1.Complete Java: Object-Oriented Programming and Projects — Udemy  </w:t>
       </w:r>
     </w:p>
     <w:p>

</xml_diff>